<commit_message>
hopefully this brawl stars essay doesn't get rejected
</commit_message>
<xml_diff>
--- a/IAT210/research essay.docx
+++ b/IAT210/research essay.docx
@@ -12,7 +12,21 @@
         <w:rPr>
           <w:lang w:val="en-US"/>
         </w:rPr>
-        <w:t>Brawls stars changed it business practices in order to protect its users</w:t>
+        <w:t xml:space="preserve">Brawls stars changed it business practices </w:t>
+      </w:r>
+      <w:proofErr w:type="gramStart"/>
+      <w:r>
+        <w:rPr>
+          <w:lang w:val="en-US"/>
+        </w:rPr>
+        <w:t>in order to</w:t>
+      </w:r>
+      <w:proofErr w:type="gramEnd"/>
+      <w:r>
+        <w:rPr>
+          <w:lang w:val="en-US"/>
+        </w:rPr>
+        <w:t xml:space="preserve"> protect its users</w:t>
       </w:r>
     </w:p>
     <w:p>
@@ -37,10 +51,135 @@
     </w:p>
     <w:p>
       <w:pPr>
-        <w:rPr>
-          <w:lang w:val="en-US"/>
-        </w:rPr>
-      </w:pPr>
+        <w:ind w:left="720"/>
+        <w:rPr>
+          <w:lang w:val="en-US"/>
+        </w:rPr>
+      </w:pPr>
+      <w:r>
+        <w:rPr>
+          <w:lang w:val="en-US"/>
+        </w:rPr>
+        <w:t>Loot boxes are generally bad</w:t>
+      </w:r>
+    </w:p>
+    <w:p>
+      <w:pPr>
+        <w:ind w:left="720"/>
+        <w:rPr>
+          <w:lang w:val="en-US"/>
+        </w:rPr>
+      </w:pPr>
+      <w:r>
+        <w:rPr>
+          <w:lang w:val="en-US"/>
+        </w:rPr>
+        <w:t>Proof</w:t>
+      </w:r>
+    </w:p>
+    <w:p>
+      <w:pPr>
+        <w:ind w:left="720"/>
+        <w:rPr>
+          <w:lang w:val="en-US"/>
+        </w:rPr>
+      </w:pPr>
+      <w:r>
+        <w:rPr>
+          <w:lang w:val="en-US"/>
+        </w:rPr>
+        <w:t>Remove loot boxes entirely</w:t>
+      </w:r>
+    </w:p>
+    <w:p>
+      <w:pPr>
+        <w:ind w:left="720"/>
+        <w:rPr>
+          <w:lang w:val="en-US"/>
+        </w:rPr>
+      </w:pPr>
+      <w:r>
+        <w:rPr>
+          <w:lang w:val="en-US"/>
+        </w:rPr>
+        <w:t>Implemented loot boxes but can’t pay for them</w:t>
+      </w:r>
+    </w:p>
+    <w:p>
+      <w:pPr>
+        <w:ind w:firstLine="720"/>
+        <w:rPr>
+          <w:lang w:val="en-US"/>
+        </w:rPr>
+      </w:pPr>
+      <w:r>
+        <w:rPr>
+          <w:lang w:val="en-US"/>
+        </w:rPr>
+        <w:t xml:space="preserve">Brawl stars removed paid loot boxes </w:t>
+      </w:r>
+    </w:p>
+    <w:p>
+      <w:pPr>
+        <w:rPr>
+          <w:lang w:val="en-US"/>
+        </w:rPr>
+      </w:pPr>
+    </w:p>
+    <w:p>
+      <w:pPr>
+        <w:rPr>
+          <w:lang w:val="en-US"/>
+        </w:rPr>
+      </w:pPr>
+      <w:r>
+        <w:rPr>
+          <w:lang w:val="en-US"/>
+        </w:rPr>
+        <w:t>Reduced pay to win</w:t>
+      </w:r>
+    </w:p>
+    <w:p>
+      <w:pPr>
+        <w:ind w:left="720"/>
+        <w:rPr>
+          <w:lang w:val="en-US"/>
+        </w:rPr>
+      </w:pPr>
+      <w:r>
+        <w:rPr>
+          <w:lang w:val="en-US"/>
+        </w:rPr>
+        <w:t xml:space="preserve">Brawl stars switched from a system that randomly gave power to characters to a system you can pick who the power goes to making it so the player can focus on which characters they want to play and feel less inclined to spend money </w:t>
+      </w:r>
+      <w:proofErr w:type="gramStart"/>
+      <w:r>
+        <w:rPr>
+          <w:lang w:val="en-US"/>
+        </w:rPr>
+        <w:t>in order to</w:t>
+      </w:r>
+      <w:proofErr w:type="gramEnd"/>
+      <w:r>
+        <w:rPr>
+          <w:lang w:val="en-US"/>
+        </w:rPr>
+        <w:t xml:space="preserve"> be competitive.</w:t>
+      </w:r>
+    </w:p>
+    <w:p>
+      <w:pPr>
+        <w:ind w:left="720"/>
+        <w:rPr>
+          <w:lang w:val="en-US"/>
+        </w:rPr>
+      </w:pPr>
+      <w:r>
+        <w:rPr>
+          <w:lang w:val="en-US"/>
+        </w:rPr>
+        <w:t>People join communities then want to be competitive in those communities</w:t>
+      </w:r>
     </w:p>
     <w:p>
       <w:pPr>
@@ -57,43 +196,112 @@
     </w:p>
     <w:p>
       <w:pPr>
-        <w:rPr>
-          <w:lang w:val="en-US"/>
-        </w:rPr>
-      </w:pPr>
-    </w:p>
-    <w:p>
-      <w:pPr>
-        <w:rPr>
-          <w:lang w:val="en-US"/>
-        </w:rPr>
-      </w:pPr>
-      <w:r>
-        <w:rPr>
-          <w:lang w:val="en-US"/>
-        </w:rPr>
-        <w:t>Reduced pay to win</w:t>
-      </w:r>
-    </w:p>
-    <w:p>
-      <w:pPr>
-        <w:rPr>
-          <w:lang w:val="en-US"/>
-        </w:rPr>
-      </w:pPr>
-    </w:p>
-    <w:p>
-      <w:pPr>
-        <w:rPr>
-          <w:lang w:val="en-US"/>
-        </w:rPr>
-      </w:pPr>
-      <w:r>
-        <w:rPr>
-          <w:lang w:val="en-US"/>
-        </w:rPr>
-        <w:t>conclusions</w:t>
-      </w:r>
+        <w:ind w:left="720"/>
+        <w:rPr>
+          <w:lang w:val="en-US"/>
+        </w:rPr>
+      </w:pPr>
+      <w:r>
+        <w:rPr>
+          <w:lang w:val="en-US"/>
+        </w:rPr>
+        <w:t>Brawl stars have an open line of communication with the community</w:t>
+      </w:r>
+    </w:p>
+    <w:p>
+      <w:pPr>
+        <w:ind w:left="720"/>
+        <w:rPr>
+          <w:lang w:val="en-US"/>
+        </w:rPr>
+      </w:pPr>
+      <w:r>
+        <w:rPr>
+          <w:lang w:val="en-US"/>
+        </w:rPr>
+        <w:t>When implementing changes they have always given warnings.</w:t>
+      </w:r>
+    </w:p>
+    <w:p>
+      <w:pPr>
+        <w:ind w:left="720"/>
+        <w:rPr>
+          <w:lang w:val="en-US"/>
+        </w:rPr>
+      </w:pPr>
+      <w:r>
+        <w:rPr>
+          <w:lang w:val="en-US"/>
+        </w:rPr>
+        <w:t xml:space="preserve">When they changed </w:t>
+      </w:r>
+      <w:proofErr w:type="gramStart"/>
+      <w:r>
+        <w:rPr>
+          <w:lang w:val="en-US"/>
+        </w:rPr>
+        <w:t>there</w:t>
+      </w:r>
+      <w:proofErr w:type="gramEnd"/>
+      <w:r>
+        <w:rPr>
+          <w:lang w:val="en-US"/>
+        </w:rPr>
+        <w:t xml:space="preserve"> battle pass </w:t>
+      </w:r>
+      <w:r>
+        <w:rPr>
+          <w:lang w:val="en-US"/>
+        </w:rPr>
+        <w:t>for purchasable with in game currency to money only they clearing explained there decision and put all the math on the table on how free to play players were going to be affected</w:t>
+      </w:r>
+    </w:p>
+    <w:p>
+      <w:pPr>
+        <w:rPr>
+          <w:lang w:val="en-US"/>
+        </w:rPr>
+      </w:pPr>
+    </w:p>
+    <w:p>
+      <w:pPr>
+        <w:rPr>
+          <w:lang w:val="en-US"/>
+        </w:rPr>
+      </w:pPr>
+      <w:r>
+        <w:rPr>
+          <w:lang w:val="en-US"/>
+        </w:rPr>
+        <w:t>C</w:t>
+      </w:r>
+      <w:r>
+        <w:rPr>
+          <w:lang w:val="en-US"/>
+        </w:rPr>
+        <w:t>onclusions</w:t>
+      </w:r>
+    </w:p>
+    <w:p>
+      <w:pPr>
+        <w:rPr>
+          <w:lang w:val="en-US"/>
+        </w:rPr>
+      </w:pPr>
+      <w:r>
+        <w:rPr>
+          <w:lang w:val="en-US"/>
+        </w:rPr>
+        <w:tab/>
+        <w:t>Summary</w:t>
+      </w:r>
+    </w:p>
+    <w:p>
+      <w:pPr>
+        <w:rPr>
+          <w:lang w:val="en-US"/>
+        </w:rPr>
+      </w:pPr>
     </w:p>
     <w:sectPr>
       <w:pgSz w:w="12240" w:h="15840"/>

</xml_diff>

<commit_message>
updates to IAT essay
</commit_message>
<xml_diff>
--- a/IAT210/research essay.docx
+++ b/IAT210/research essay.docx
@@ -12,21 +12,7 @@
         <w:rPr>
           <w:lang w:val="en-US"/>
         </w:rPr>
-        <w:t xml:space="preserve">Brawls stars changed it business practices </w:t>
-      </w:r>
-      <w:proofErr w:type="gramStart"/>
-      <w:r>
-        <w:rPr>
-          <w:lang w:val="en-US"/>
-        </w:rPr>
-        <w:t>in order to</w:t>
-      </w:r>
-      <w:proofErr w:type="gramEnd"/>
-      <w:r>
-        <w:rPr>
-          <w:lang w:val="en-US"/>
-        </w:rPr>
-        <w:t xml:space="preserve"> protect its users</w:t>
+        <w:t>Brawls stars changed it business practices in order to protect its users</w:t>
       </w:r>
     </w:p>
     <w:p>
@@ -65,35 +51,7 @@
         <w:rPr>
           <w:lang w:val="en-US"/>
         </w:rPr>
-        <w:t xml:space="preserve">because even though brawl stars initially removed loot boxes </w:t>
-      </w:r>
-      <w:proofErr w:type="gramStart"/>
-      <w:r>
-        <w:rPr>
-          <w:lang w:val="en-US"/>
-        </w:rPr>
-        <w:t>completely</w:t>
-      </w:r>
-      <w:proofErr w:type="gramEnd"/>
-      <w:r>
-        <w:rPr>
-          <w:lang w:val="en-US"/>
-        </w:rPr>
-        <w:t xml:space="preserve"> they then </w:t>
-      </w:r>
-      <w:proofErr w:type="gramStart"/>
-      <w:r>
-        <w:rPr>
-          <w:lang w:val="en-US"/>
-        </w:rPr>
-        <w:t>readded</w:t>
-      </w:r>
-      <w:proofErr w:type="gramEnd"/>
-      <w:r>
-        <w:rPr>
-          <w:lang w:val="en-US"/>
-        </w:rPr>
-        <w:t xml:space="preserve"> them in a different form, but you could no longer purchase them.</w:t>
+        <w:t>because even though brawl stars initially removed loot boxes completely they then readded them in a different form, but you could no longer purchase them.</w:t>
       </w:r>
     </w:p>
     <w:p>
@@ -124,21 +82,7 @@
         <w:rPr>
           <w:lang w:val="en-US"/>
         </w:rPr>
-        <w:t xml:space="preserve">First let’s talk about the positives, loot boxes add a lot of excitement. They have big highs and big lows, Brawl stars loot boxes always gave you something, so you always got value for your money, but sometimes you could get much better rewards than others. This excitement that comes from big highs and big lows share a lot of similarities with gambling and when loot boxes can be </w:t>
-      </w:r>
-      <w:proofErr w:type="gramStart"/>
-      <w:r>
-        <w:rPr>
-          <w:lang w:val="en-US"/>
-        </w:rPr>
-        <w:t>purchased</w:t>
-      </w:r>
-      <w:proofErr w:type="gramEnd"/>
-      <w:r>
-        <w:rPr>
-          <w:lang w:val="en-US"/>
-        </w:rPr>
-        <w:t xml:space="preserve"> they share if more similarities to gambling. This similarity to gambling is the negative of loot boxes.</w:t>
+        <w:t>First let’s talk about the positives, loot boxes add a lot of excitement. They have big highs and big lows, Brawl stars loot boxes always gave you something, so you always got value for your money, but sometimes you could get much better rewards than others. This excitement that comes from big highs and big lows share a lot of similarities with gambling and when loot boxes can be purchased they share if more similarities to gambling. This similarity to gambling is the negative of loot boxes.</w:t>
       </w:r>
     </w:p>
     <w:p>
@@ -227,21 +171,7 @@
         <w:rPr>
           <w:rFonts w:ascii="Times New Roman" w:hAnsi="Times New Roman" w:cs="Times New Roman"/>
         </w:rPr>
-        <w:t xml:space="preserve"> combined to make loot boxes </w:t>
-      </w:r>
-      <w:proofErr w:type="gramStart"/>
-      <w:r>
-        <w:rPr>
-          <w:rFonts w:ascii="Times New Roman" w:hAnsi="Times New Roman" w:cs="Times New Roman"/>
-        </w:rPr>
-        <w:t>really bad</w:t>
-      </w:r>
-      <w:proofErr w:type="gramEnd"/>
-      <w:r>
-        <w:rPr>
-          <w:rFonts w:ascii="Times New Roman" w:hAnsi="Times New Roman" w:cs="Times New Roman"/>
-        </w:rPr>
-        <w:t xml:space="preserve"> for people that are susceptible to gambling habits</w:t>
+        <w:t xml:space="preserve"> combined to make loot boxes really bad for people that are susceptible to gambling habits</w:t>
       </w:r>
       <w:r>
         <w:rPr>
@@ -260,21 +190,7 @@
         <w:rPr>
           <w:lang w:val="en-US"/>
         </w:rPr>
-        <w:t xml:space="preserve">When brawl stars removed loot </w:t>
-      </w:r>
-      <w:proofErr w:type="gramStart"/>
-      <w:r>
-        <w:rPr>
-          <w:lang w:val="en-US"/>
-        </w:rPr>
-        <w:t>boxes</w:t>
-      </w:r>
-      <w:proofErr w:type="gramEnd"/>
-      <w:r>
-        <w:rPr>
-          <w:lang w:val="en-US"/>
-        </w:rPr>
-        <w:t xml:space="preserve"> they said it was to reduce the amount a small amount of people spend on the game and increase the amount the average player spends. They did not want to take advantage of the people susceptible to gambling habits. </w:t>
+        <w:t xml:space="preserve">When brawl stars removed loot boxes they said it was to reduce the amount a small amount of people spend on the game and increase the amount the average player spends. They did not want to take advantage of the people susceptible to gambling habits. </w:t>
       </w:r>
       <w:r>
         <w:rPr>
@@ -286,7 +202,7 @@
         <w:rPr>
           <w:lang w:val="en-US"/>
         </w:rPr>
-        <w:t xml:space="preserve">. This is not </w:t>
+        <w:t>.</w:t>
       </w:r>
     </w:p>
     <w:p>
@@ -461,21 +377,7 @@
         <w:rPr>
           <w:lang w:val="en-US"/>
         </w:rPr>
-        <w:t xml:space="preserve"> </w:t>
-      </w:r>
-      <w:proofErr w:type="gramStart"/>
-      <w:r>
-        <w:rPr>
-          <w:lang w:val="en-US"/>
-        </w:rPr>
-        <w:t>pay</w:t>
-      </w:r>
-      <w:proofErr w:type="gramEnd"/>
-      <w:r>
-        <w:rPr>
-          <w:lang w:val="en-US"/>
-        </w:rPr>
-        <w:t xml:space="preserve"> to win (P2W)</w:t>
+        <w:t xml:space="preserve"> pay to win (P2W)</w:t>
       </w:r>
       <w:r>
         <w:rPr>
@@ -529,35 +431,7 @@
         <w:rPr>
           <w:lang w:val="en-US"/>
         </w:rPr>
-        <w:t xml:space="preserve"> Brawl stars </w:t>
-      </w:r>
-      <w:proofErr w:type="gramStart"/>
-      <w:r>
-        <w:rPr>
-          <w:lang w:val="en-US"/>
-        </w:rPr>
-        <w:t>falls</w:t>
-      </w:r>
-      <w:proofErr w:type="gramEnd"/>
-      <w:r>
-        <w:rPr>
-          <w:lang w:val="en-US"/>
-        </w:rPr>
-        <w:t xml:space="preserve"> under the player vs player competitive categories and is thus very easy to be </w:t>
-      </w:r>
-      <w:proofErr w:type="gramStart"/>
-      <w:r>
-        <w:rPr>
-          <w:lang w:val="en-US"/>
-        </w:rPr>
-        <w:t>pay</w:t>
-      </w:r>
-      <w:proofErr w:type="gramEnd"/>
-      <w:r>
-        <w:rPr>
-          <w:lang w:val="en-US"/>
-        </w:rPr>
-        <w:t xml:space="preserve"> to win if you allow buying power. In brawl stars each character you want to play has their own power level from 1 to 11, a character at power 11 is twice as strong as a character as power 1. The game is also balance</w:t>
+        <w:t xml:space="preserve"> Brawl stars falls under the player vs player competitive categories and is thus very easy to be pay to win if you allow buying power. In brawl stars each character you want to play has their own power level from 1 to 11, a character at power 11 is twice as strong as a character as power 1. The game is also balance</w:t>
       </w:r>
       <w:r>
         <w:rPr>
@@ -596,49 +470,7 @@
         <w:rPr>
           <w:lang w:val="en-US"/>
         </w:rPr>
-        <w:t xml:space="preserve">This results in Brawl stars being very </w:t>
-      </w:r>
-      <w:proofErr w:type="gramStart"/>
-      <w:r>
-        <w:rPr>
-          <w:lang w:val="en-US"/>
-        </w:rPr>
-        <w:t>pay</w:t>
-      </w:r>
-      <w:proofErr w:type="gramEnd"/>
-      <w:r>
-        <w:rPr>
-          <w:lang w:val="en-US"/>
-        </w:rPr>
-        <w:t xml:space="preserve"> to win. Especially when you consider how they used to distribute the power. When Brawl Stars had loot boxes you would receive some power tokens for a couple random characters each time you open a box. Then when you collected enough power tokens on a single character you could increase their level. The result of this was on average all your characters increased in power at about the same rate. Meaning if you wanted to play at the designed level of 11 you </w:t>
-      </w:r>
-      <w:proofErr w:type="gramStart"/>
-      <w:r>
-        <w:rPr>
-          <w:lang w:val="en-US"/>
-        </w:rPr>
-        <w:t>have to</w:t>
-      </w:r>
-      <w:proofErr w:type="gramEnd"/>
-      <w:r>
-        <w:rPr>
-          <w:lang w:val="en-US"/>
-        </w:rPr>
-        <w:t xml:space="preserve"> very slowly level all your brawls to that level, highly incentivizing purchasing more boxes to get more power. </w:t>
-      </w:r>
-      <w:proofErr w:type="gramStart"/>
-      <w:r>
-        <w:rPr>
-          <w:lang w:val="en-US"/>
-        </w:rPr>
-        <w:t>Luckly</w:t>
-      </w:r>
-      <w:proofErr w:type="gramEnd"/>
-      <w:r>
-        <w:rPr>
-          <w:lang w:val="en-US"/>
-        </w:rPr>
-        <w:t xml:space="preserve"> they changed the system.</w:t>
+        <w:t>This results in Brawl stars being very pay to win. Especially when you consider how they used to distribute the power. When Brawl Stars had loot boxes you would receive some power tokens for a couple random characters each time you open a box. Then when you collected enough power tokens on a single character you could increase their level. The result of this was on average all your characters increased in power at about the same rate. Meaning if you wanted to play at the designed level of 11 you have to very slowly level all your brawls to that level, highly incentivizing purchasing more boxes to get more power. Luckly they changed the system.</w:t>
       </w:r>
     </w:p>
     <w:p>
@@ -846,6 +678,12 @@
         </w:rPr>
         <w:t xml:space="preserve"> the power tokens applicable to any characters</w:t>
       </w:r>
+      <w:r>
+        <w:rPr>
+          <w:lang w:val="en-US"/>
+        </w:rPr>
+        <w:t>. Now when you get power tokens you can spend theme on any character you wish. Unfortunately this does not mean you get more competitive characters. It does mean you can choose which character become competitive first not all your characters become competitive at the same time. This change made it so even a player who only plays for a week can have at least one competitive character. Making it much easier to play with your friends and not feel left out.</w:t>
+      </w:r>
     </w:p>
     <w:p>
       <w:pPr>
@@ -872,21 +710,8 @@
         <w:rPr>
           <w:lang w:val="en-US"/>
         </w:rPr>
-        <w:t xml:space="preserve">Brawl stars switched from a system that randomly gave power to characters to a system you can pick who the power goes to making it so the player can focus on which characters they want to play and feel less inclined to spend money </w:t>
-      </w:r>
-      <w:proofErr w:type="gramStart"/>
-      <w:r>
-        <w:rPr>
-          <w:lang w:val="en-US"/>
-        </w:rPr>
-        <w:t>in order to</w:t>
-      </w:r>
-      <w:proofErr w:type="gramEnd"/>
-      <w:r>
-        <w:rPr>
-          <w:lang w:val="en-US"/>
-        </w:rPr>
-        <w:t xml:space="preserve"> be competitive.</w:t>
+        <w:lastRenderedPageBreak/>
+        <w:t>Brawl stars switched from a system that randomly gave power to characters to a system you can pick who the power goes to making it so the player can focus on which characters they want to play and feel less inclined to spend money in order to be competitive.</w:t>
       </w:r>
     </w:p>
     <w:p>
@@ -913,8 +738,39 @@
         <w:rPr>
           <w:lang w:val="en-US"/>
         </w:rPr>
-        <w:lastRenderedPageBreak/>
         <w:t>Open communication with community</w:t>
+      </w:r>
+    </w:p>
+    <w:p>
+      <w:pPr>
+        <w:rPr>
+          <w:lang w:val="en-US"/>
+        </w:rPr>
+      </w:pPr>
+    </w:p>
+    <w:p>
+      <w:pPr>
+        <w:rPr>
+          <w:lang w:val="en-US"/>
+        </w:rPr>
+      </w:pPr>
+      <w:r>
+        <w:rPr>
+          <w:lang w:val="en-US"/>
+        </w:rPr>
+        <w:t xml:space="preserve">Lots of game developers have so little communication with their players that they seem secretive. Brawl Stars is the opposite </w:t>
+      </w:r>
+      <w:r>
+        <w:rPr>
+          <w:lang w:val="en-US"/>
+        </w:rPr>
+        <w:t>they are very open with their community.</w:t>
+      </w:r>
+      <w:r>
+        <w:rPr>
+          <w:lang w:val="en-US"/>
+        </w:rPr>
+        <w:t xml:space="preserve"> Having an open line of communication with the community helps keep players understand the development decisions and allows players to make better decisions of their own. </w:t>
       </w:r>
     </w:p>
     <w:p>
@@ -985,21 +841,7 @@
         <w:rPr>
           <w:lang w:val="en-US"/>
         </w:rPr>
-        <w:t xml:space="preserve">When they changed </w:t>
-      </w:r>
-      <w:proofErr w:type="gramStart"/>
-      <w:r>
-        <w:rPr>
-          <w:lang w:val="en-US"/>
-        </w:rPr>
-        <w:t>there</w:t>
-      </w:r>
-      <w:proofErr w:type="gramEnd"/>
-      <w:r>
-        <w:rPr>
-          <w:lang w:val="en-US"/>
-        </w:rPr>
-        <w:t xml:space="preserve"> battle pass </w:t>
+        <w:t xml:space="preserve">When they changed there battle pass </w:t>
       </w:r>
       <w:r>
         <w:rPr>

</xml_diff>

<commit_message>
completed draft body paragraphs for IAT210
</commit_message>
<xml_diff>
--- a/IAT210/research essay.docx
+++ b/IAT210/research essay.docx
@@ -12,6 +12,12 @@
         <w:rPr>
           <w:lang w:val="en-US"/>
         </w:rPr>
+        <w:t xml:space="preserve"> </w:t>
+      </w:r>
+      <w:r>
+        <w:rPr>
+          <w:lang w:val="en-US"/>
+        </w:rPr>
         <w:t>Brawls stars changed it business practices in order to protect its users</w:t>
       </w:r>
     </w:p>
@@ -21,6 +27,33 @@
           <w:lang w:val="en-US"/>
         </w:rPr>
       </w:pPr>
+      <w:r>
+        <w:rPr>
+          <w:lang w:val="en-US"/>
+        </w:rPr>
+        <w:t xml:space="preserve">Mobile games are often sneered at. One of the reasons mobile games are sneered at is lots were something called a </w:t>
+      </w:r>
+      <w:proofErr w:type="spellStart"/>
+      <w:r>
+        <w:rPr>
+          <w:lang w:val="en-US"/>
+        </w:rPr>
+        <w:t>gacha</w:t>
+      </w:r>
+      <w:proofErr w:type="spellEnd"/>
+      <w:r>
+        <w:rPr>
+          <w:lang w:val="en-US"/>
+        </w:rPr>
+        <w:t xml:space="preserve"> game. The game entices the player to spend real money to buy random in game rewards. This practice is frowned upon because it make the game feel a lot like gambling</w:t>
+      </w:r>
+    </w:p>
+    <w:p>
+      <w:pPr>
+        <w:rPr>
+          <w:lang w:val="en-US"/>
+        </w:rPr>
+      </w:pPr>
     </w:p>
     <w:p>
       <w:pPr>
@@ -51,7 +84,19 @@
         <w:rPr>
           <w:lang w:val="en-US"/>
         </w:rPr>
-        <w:t>because even though brawl stars initially removed loot boxes completely they then readded them in a different form, but you could no longer purchase them.</w:t>
+        <w:t>because even though brawl stars initially removed loot boxes completely they then re</w:t>
+      </w:r>
+      <w:r>
+        <w:rPr>
+          <w:lang w:val="en-US"/>
+        </w:rPr>
+        <w:t>-</w:t>
+      </w:r>
+      <w:r>
+        <w:rPr>
+          <w:lang w:val="en-US"/>
+        </w:rPr>
+        <w:t>added them in a different form, but you could no longer purchase them.</w:t>
       </w:r>
     </w:p>
     <w:p>
@@ -177,7 +222,19 @@
         <w:rPr>
           <w:lang w:val="en-US"/>
         </w:rPr>
-        <w:t>. Children who don’t have a fully formed frontal lode, the part of the brain that regulates impulse control, are more susceptible to loot boxes.</w:t>
+        <w:t>. Children who don’t have a fully formed frontal lode, the part of the brain that regulates impulse control, are more susceptible to loot boxes</w:t>
+      </w:r>
+      <w:r>
+        <w:rPr>
+          <w:lang w:val="en-US"/>
+        </w:rPr>
+        <w:t>()</w:t>
+      </w:r>
+      <w:r>
+        <w:rPr>
+          <w:lang w:val="en-US"/>
+        </w:rPr>
+        <w:t>.</w:t>
       </w:r>
     </w:p>
     <w:p>
@@ -203,6 +260,57 @@
           <w:lang w:val="en-US"/>
         </w:rPr>
         <w:t>.</w:t>
+      </w:r>
+      <w:r>
+        <w:rPr>
+          <w:lang w:val="en-US"/>
+        </w:rPr>
+        <w:t xml:space="preserve"> This was</w:t>
+      </w:r>
+      <w:r>
+        <w:rPr>
+          <w:lang w:val="en-US"/>
+        </w:rPr>
+        <w:t xml:space="preserve"> one of</w:t>
+      </w:r>
+      <w:r>
+        <w:rPr>
+          <w:lang w:val="en-US"/>
+        </w:rPr>
+        <w:t xml:space="preserve"> the first important change brawl stars made to</w:t>
+      </w:r>
+      <w:r>
+        <w:rPr>
+          <w:lang w:val="en-US"/>
+        </w:rPr>
+        <w:t xml:space="preserve"> be become less like a </w:t>
+      </w:r>
+      <w:proofErr w:type="spellStart"/>
+      <w:r>
+        <w:rPr>
+          <w:lang w:val="en-US"/>
+        </w:rPr>
+        <w:t>gacha</w:t>
+      </w:r>
+      <w:proofErr w:type="spellEnd"/>
+      <w:r>
+        <w:rPr>
+          <w:lang w:val="en-US"/>
+        </w:rPr>
+        <w:t xml:space="preserve"> game and less P2W.</w:t>
+      </w:r>
+    </w:p>
+    <w:p>
+      <w:pPr>
+        <w:rPr>
+          <w:lang w:val="en-US"/>
+        </w:rPr>
+      </w:pPr>
+      <w:r>
+        <w:rPr>
+          <w:lang w:val="en-US"/>
+        </w:rPr>
+        <w:t>Brawl stars did later add loot boxes back into the game, under a different name. Very importantly these loot boxes can not be purchased. You can only get them by playing the game and there is a low maximum that you can get. Meaning people cannot spend money to gamble. But they also can’t spend more time to gamble more infinitely.</w:t>
       </w:r>
     </w:p>
     <w:p>
@@ -226,6 +334,7 @@
         <w:ind w:left="720" w:hanging="720"/>
       </w:pPr>
       <w:r>
+        <w:lastRenderedPageBreak/>
         <w:t xml:space="preserve">Drummond, A., &amp; Sauer, J. D. (2018). Video game loot boxes are psychologically akin to gambling. </w:t>
       </w:r>
       <w:r>
@@ -317,67 +426,606 @@
         <w:rPr>
           <w:lang w:val="en-US"/>
         </w:rPr>
+        <w:t>Implemented loot boxes but can’t pay for them</w:t>
+      </w:r>
+    </w:p>
+    <w:p>
+      <w:pPr>
+        <w:ind w:firstLine="720"/>
+        <w:rPr>
+          <w:lang w:val="en-US"/>
+        </w:rPr>
+      </w:pPr>
+      <w:r>
+        <w:rPr>
+          <w:lang w:val="en-US"/>
+        </w:rPr>
+        <w:t xml:space="preserve">Brawl stars removed paid loot boxes </w:t>
+      </w:r>
+    </w:p>
+    <w:p>
+      <w:pPr>
+        <w:rPr>
+          <w:lang w:val="en-US"/>
+        </w:rPr>
+      </w:pPr>
+    </w:p>
+    <w:p>
+      <w:pPr>
+        <w:rPr>
+          <w:lang w:val="en-US"/>
+        </w:rPr>
+      </w:pPr>
+      <w:r>
+        <w:rPr>
+          <w:lang w:val="en-US"/>
+        </w:rPr>
+        <w:t>Reduced pay to win</w:t>
+      </w:r>
+    </w:p>
+    <w:p>
+      <w:pPr>
+        <w:rPr>
+          <w:lang w:val="en-US"/>
+        </w:rPr>
+      </w:pPr>
+      <w:r>
+        <w:rPr>
+          <w:lang w:val="en-US"/>
+        </w:rPr>
+        <w:t>Brawl stars protected their users by reducing the</w:t>
+      </w:r>
+      <w:r>
+        <w:rPr>
+          <w:lang w:val="en-US"/>
+        </w:rPr>
+        <w:t xml:space="preserve"> amount the game is</w:t>
+      </w:r>
+      <w:r>
+        <w:rPr>
+          <w:lang w:val="en-US"/>
+        </w:rPr>
+        <w:t xml:space="preserve"> pay to win (P2W)</w:t>
+      </w:r>
+      <w:r>
+        <w:rPr>
+          <w:lang w:val="en-US"/>
+        </w:rPr>
+        <w:t>.</w:t>
+      </w:r>
+      <w:r>
+        <w:rPr>
+          <w:lang w:val="en-US"/>
+        </w:rPr>
+        <w:t xml:space="preserve"> P2W </w:t>
+      </w:r>
+      <w:r>
+        <w:rPr>
+          <w:lang w:val="en-US"/>
+        </w:rPr>
+        <w:t>games are</w:t>
+      </w:r>
+      <w:r>
+        <w:rPr>
+          <w:lang w:val="en-US"/>
+        </w:rPr>
+        <w:t xml:space="preserve"> game</w:t>
+      </w:r>
+      <w:r>
+        <w:rPr>
+          <w:lang w:val="en-US"/>
+        </w:rPr>
+        <w:t>s that</w:t>
+      </w:r>
+      <w:r>
+        <w:rPr>
+          <w:lang w:val="en-US"/>
+        </w:rPr>
+        <w:t xml:space="preserve"> let you buy power within the game with real money. Specifically, the game needs to also be competitive. Examples of this include the obvious, game</w:t>
+      </w:r>
+      <w:r>
+        <w:rPr>
+          <w:lang w:val="en-US"/>
+        </w:rPr>
+        <w:t>s</w:t>
+      </w:r>
+      <w:r>
+        <w:rPr>
+          <w:lang w:val="en-US"/>
+        </w:rPr>
+        <w:t xml:space="preserve"> that have a player vs player element, but also less obvious are games that have leaderboards where players can compete for higher scores.</w:t>
+      </w:r>
+      <w:r>
+        <w:rPr>
+          <w:lang w:val="en-US"/>
+        </w:rPr>
+        <w:t xml:space="preserve"> Brawl stars falls under the player vs player competitive categories and is thus very easy to be pay to win if you allow buying power. In brawl stars each character you want to play has their own power level from 1 to 11, a character at power 11 is twice as strong as a character as power 1. The game is also balance</w:t>
+      </w:r>
+      <w:r>
+        <w:rPr>
+          <w:lang w:val="en-US"/>
+        </w:rPr>
+        <w:t>d</w:t>
+      </w:r>
+      <w:r>
+        <w:rPr>
+          <w:lang w:val="en-US"/>
+        </w:rPr>
+        <w:t xml:space="preserve"> around thinking that everyone is playing characters that are level 11.</w:t>
+      </w:r>
+    </w:p>
+    <w:p>
+      <w:pPr>
+        <w:ind w:firstLine="720"/>
+        <w:rPr>
+          <w:lang w:val="en-US"/>
+        </w:rPr>
+      </w:pPr>
+      <w:r>
+        <w:rPr>
+          <w:lang w:val="en-US"/>
+        </w:rPr>
+        <w:t>Picture of Colt in brawls stars power screen</w:t>
+      </w:r>
+    </w:p>
+    <w:p>
+      <w:pPr>
+        <w:rPr>
+          <w:lang w:val="en-US"/>
+        </w:rPr>
+      </w:pPr>
+      <w:r>
+        <w:rPr>
+          <w:lang w:val="en-US"/>
+        </w:rPr>
+        <w:t>This results in Brawl stars being very pay to win. Especially when you consider how they used to distribute the power. When Brawl Stars had loot boxes you would receive some power tokens for a couple random characters each time you open a box. Then when you collected enough power tokens on a single character you could increase their level. The result of this was on average all your characters increased in power at about the same rate. Meaning if you wanted to play at the designed level of 11 you have to very slowly level all your brawls to that level, highly incentivizing purchasing more boxes to get more power. Luckly they changed the system.</w:t>
+      </w:r>
+    </w:p>
+    <w:p>
+      <w:pPr>
+        <w:rPr>
+          <w:lang w:val="en-US"/>
+        </w:rPr>
+      </w:pPr>
+      <w:r>
+        <w:rPr>
+          <w:lang w:val="en-US"/>
+        </w:rPr>
+        <w:t>This old system made the entire game very P2W</w:t>
+      </w:r>
+      <w:r>
+        <w:rPr>
+          <w:lang w:val="en-US"/>
+        </w:rPr>
+        <w:t>.</w:t>
+      </w:r>
+      <w:r>
+        <w:rPr>
+          <w:lang w:val="en-US"/>
+        </w:rPr>
+        <w:t xml:space="preserve"> I personally have only </w:t>
+      </w:r>
+      <w:r>
+        <w:rPr>
+          <w:lang w:val="en-US"/>
+        </w:rPr>
+        <w:t>spent</w:t>
+      </w:r>
+      <w:r>
+        <w:rPr>
+          <w:lang w:val="en-US"/>
+        </w:rPr>
+        <w:t xml:space="preserve"> 10 dollars on the game to buy a cosmetic item</w:t>
+      </w:r>
+      <w:r>
+        <w:rPr>
+          <w:lang w:val="en-US"/>
+        </w:rPr>
+        <w:t>.</w:t>
+      </w:r>
+      <w:r>
+        <w:rPr>
+          <w:lang w:val="en-US"/>
+        </w:rPr>
+        <w:t xml:space="preserve"> I have </w:t>
+      </w:r>
+      <w:r>
+        <w:rPr>
+          <w:lang w:val="en-US"/>
+        </w:rPr>
+        <w:t>played for</w:t>
+      </w:r>
+      <w:r>
+        <w:rPr>
+          <w:lang w:val="en-US"/>
+        </w:rPr>
+        <w:t xml:space="preserve"> a very long time </w:t>
+      </w:r>
+      <w:r>
+        <w:rPr>
+          <w:lang w:val="en-US"/>
+        </w:rPr>
+        <w:t xml:space="preserve">so am </w:t>
+      </w:r>
+      <w:r>
+        <w:rPr>
+          <w:lang w:val="en-US"/>
+        </w:rPr>
+        <w:t>able to play at the competitive level without paying. When a new player joined</w:t>
+      </w:r>
+      <w:r>
+        <w:rPr>
+          <w:lang w:val="en-US"/>
+        </w:rPr>
+        <w:t>,</w:t>
+      </w:r>
+      <w:r>
+        <w:rPr>
+          <w:lang w:val="en-US"/>
+        </w:rPr>
+        <w:t xml:space="preserve"> when the old power system was in place, they either had to play for over two years or spend </w:t>
+      </w:r>
+      <w:r>
+        <w:rPr>
+          <w:lang w:val="en-US"/>
+        </w:rPr>
+        <w:t xml:space="preserve">a large amount of money to play competitively. </w:t>
+      </w:r>
+      <w:r>
+        <w:rPr>
+          <w:lang w:val="en-US"/>
+        </w:rPr>
+        <w:t>Unfortunately, the younger a person is the more likely they are to buy power to games (</w:t>
+      </w:r>
+      <w:r>
+        <w:rPr>
+          <w:lang w:val="en-US"/>
+        </w:rPr>
+        <w:t>Bernadeta</w:t>
+      </w:r>
+      <w:r>
+        <w:rPr>
+          <w:lang w:val="en-US"/>
+        </w:rPr>
+        <w:t xml:space="preserve">, 2021). </w:t>
+      </w:r>
+      <w:r>
+        <w:rPr>
+          <w:lang w:val="en-US"/>
+        </w:rPr>
+        <w:t>Brawl</w:t>
+      </w:r>
+      <w:r>
+        <w:rPr>
+          <w:lang w:val="en-US"/>
+        </w:rPr>
+        <w:t xml:space="preserve"> Stars </w:t>
+      </w:r>
+      <w:r>
+        <w:rPr>
+          <w:lang w:val="en-US"/>
+        </w:rPr>
+        <w:t>is designed for player</w:t>
+      </w:r>
+      <w:r>
+        <w:rPr>
+          <w:lang w:val="en-US"/>
+        </w:rPr>
+        <w:t>s</w:t>
+      </w:r>
+      <w:r>
+        <w:rPr>
+          <w:lang w:val="en-US"/>
+        </w:rPr>
+        <w:t xml:space="preserve"> that are 13 and </w:t>
+      </w:r>
+      <w:r>
+        <w:rPr>
+          <w:lang w:val="en-US"/>
+        </w:rPr>
+        <w:t xml:space="preserve">above. The game was designed for a </w:t>
+      </w:r>
+      <w:r>
+        <w:rPr>
+          <w:lang w:val="en-US"/>
+        </w:rPr>
+        <w:t>young</w:t>
+      </w:r>
+      <w:r>
+        <w:rPr>
+          <w:lang w:val="en-US"/>
+        </w:rPr>
+        <w:t>er audience. Young people are more susceptible to</w:t>
+      </w:r>
+      <w:r>
+        <w:rPr>
+          <w:lang w:val="en-US"/>
+        </w:rPr>
+        <w:t xml:space="preserve"> fear of missing out</w:t>
+      </w:r>
+      <w:r>
+        <w:rPr>
+          <w:lang w:val="en-US"/>
+        </w:rPr>
+        <w:t xml:space="preserve">. This </w:t>
+      </w:r>
+      <w:r>
+        <w:rPr>
+          <w:lang w:val="en-US"/>
+        </w:rPr>
         <w:lastRenderedPageBreak/>
-        <w:t>Implemented loot boxes but can’t pay for them</w:t>
-      </w:r>
-    </w:p>
-    <w:p>
-      <w:pPr>
-        <w:ind w:firstLine="720"/>
-        <w:rPr>
-          <w:lang w:val="en-US"/>
-        </w:rPr>
-      </w:pPr>
-      <w:r>
-        <w:rPr>
-          <w:lang w:val="en-US"/>
-        </w:rPr>
-        <w:t xml:space="preserve">Brawl stars removed paid loot boxes </w:t>
-      </w:r>
-    </w:p>
-    <w:p>
-      <w:pPr>
-        <w:rPr>
-          <w:lang w:val="en-US"/>
-        </w:rPr>
-      </w:pPr>
-    </w:p>
-    <w:p>
-      <w:pPr>
-        <w:rPr>
-          <w:lang w:val="en-US"/>
-        </w:rPr>
-      </w:pPr>
-      <w:r>
-        <w:rPr>
-          <w:lang w:val="en-US"/>
-        </w:rPr>
-        <w:t>Reduced pay to win</w:t>
-      </w:r>
-    </w:p>
-    <w:p>
-      <w:pPr>
-        <w:rPr>
-          <w:lang w:val="en-US"/>
-        </w:rPr>
-      </w:pPr>
-      <w:r>
-        <w:rPr>
-          <w:lang w:val="en-US"/>
-        </w:rPr>
-        <w:t>Brawl stars protected their users by reducing the</w:t>
-      </w:r>
-      <w:r>
-        <w:rPr>
-          <w:lang w:val="en-US"/>
-        </w:rPr>
-        <w:t xml:space="preserve"> amount the game is</w:t>
-      </w:r>
-      <w:r>
-        <w:rPr>
-          <w:lang w:val="en-US"/>
-        </w:rPr>
-        <w:t xml:space="preserve"> pay to win (P2W)</w:t>
+        <w:t>fear could compel those of a younger audience</w:t>
+      </w:r>
+      <w:r>
+        <w:rPr>
+          <w:lang w:val="en-US"/>
+        </w:rPr>
+        <w:t xml:space="preserve"> to spend money on the game to keep up with their friends</w:t>
+      </w:r>
+      <w:r>
+        <w:rPr>
+          <w:lang w:val="en-US"/>
+        </w:rPr>
+        <w:t xml:space="preserve"> or remain competitive</w:t>
+      </w:r>
+      <w:r>
+        <w:rPr>
+          <w:lang w:val="en-US"/>
+        </w:rPr>
+        <w:t xml:space="preserve">. </w:t>
+      </w:r>
+    </w:p>
+    <w:p>
+      <w:pPr>
+        <w:rPr>
+          <w:lang w:val="en-US"/>
+        </w:rPr>
+      </w:pPr>
+      <w:r>
+        <w:rPr>
+          <w:lang w:val="en-US"/>
+        </w:rPr>
+        <w:t>Brawl Stars changed their progression system to limit the P2W of the game by making</w:t>
+      </w:r>
+      <w:r>
+        <w:rPr>
+          <w:lang w:val="en-US"/>
+        </w:rPr>
+        <w:t xml:space="preserve"> the power tokens applicable to any characters</w:t>
+      </w:r>
+      <w:r>
+        <w:rPr>
+          <w:lang w:val="en-US"/>
+        </w:rPr>
+        <w:t>. Now when you get power tokens you can spend theme on any character you wish. Unfortunately this does not mean you get more competitive characters. It does mean you can choose which character become competitive first not all your characters become competitive at the same time. This change made it so even a player who only plays for a week can have at least one competitive character. Making it much easier to play with your friends and not feel left out.</w:t>
+      </w:r>
+    </w:p>
+    <w:p>
+      <w:pPr>
+        <w:ind w:left="720"/>
+        <w:rPr>
+          <w:lang w:val="en-US"/>
+        </w:rPr>
+      </w:pPr>
+      <w:r>
+        <w:rPr>
+          <w:lang w:val="en-US"/>
+        </w:rPr>
+        <w:t>https://www-sciencedirect-com.proxy.lib.sfu.ca/science/article/pii/S0747563220303393?via%3Dihub</w:t>
+      </w:r>
+    </w:p>
+    <w:p>
+      <w:pPr>
+        <w:ind w:left="720"/>
+        <w:rPr>
+          <w:lang w:val="en-US"/>
+        </w:rPr>
+      </w:pPr>
+      <w:r>
+        <w:rPr>
+          <w:lang w:val="en-US"/>
+        </w:rPr>
+        <w:t>Brawl stars switched from a system that randomly gave power to characters to a system you can pick who the power goes to making it so the player can focus on which characters they want to play and feel less inclined to spend money in order to be competitive.</w:t>
+      </w:r>
+    </w:p>
+    <w:p>
+      <w:pPr>
+        <w:ind w:left="720"/>
+        <w:rPr>
+          <w:lang w:val="en-US"/>
+        </w:rPr>
+      </w:pPr>
+      <w:r>
+        <w:rPr>
+          <w:lang w:val="en-US"/>
+        </w:rPr>
+        <w:t>People join communities then want to be competitive in those communities</w:t>
+      </w:r>
+    </w:p>
+    <w:p>
+      <w:pPr>
+        <w:rPr>
+          <w:lang w:val="en-US"/>
+        </w:rPr>
+      </w:pPr>
+      <w:r>
+        <w:rPr>
+          <w:lang w:val="en-US"/>
+        </w:rPr>
+        <w:t>Open communication with community</w:t>
+      </w:r>
+    </w:p>
+    <w:p>
+      <w:pPr>
+        <w:rPr>
+          <w:lang w:val="en-US"/>
+        </w:rPr>
+      </w:pPr>
+    </w:p>
+    <w:p>
+      <w:pPr>
+        <w:rPr>
+          <w:lang w:val="en-US"/>
+        </w:rPr>
+      </w:pPr>
+      <w:r>
+        <w:rPr>
+          <w:lang w:val="en-US"/>
+        </w:rPr>
+        <w:t xml:space="preserve">Lots of game developers have so little communication with their players that they seem secretive. Brawl Stars is the </w:t>
+      </w:r>
+      <w:r>
+        <w:rPr>
+          <w:lang w:val="en-US"/>
+        </w:rPr>
+        <w:t>opposite,</w:t>
+      </w:r>
+      <w:r>
+        <w:rPr>
+          <w:lang w:val="en-US"/>
+        </w:rPr>
+        <w:t xml:space="preserve"> </w:t>
+      </w:r>
+      <w:r>
+        <w:rPr>
+          <w:lang w:val="en-US"/>
+        </w:rPr>
+        <w:t>they are very open with their community.</w:t>
+      </w:r>
+      <w:r>
+        <w:rPr>
+          <w:lang w:val="en-US"/>
+        </w:rPr>
+        <w:t xml:space="preserve"> Having an open line of communication with the community helps keep players understand the development decisions and allows players to make better decisions of their own. </w:t>
+      </w:r>
+    </w:p>
+    <w:p>
+      <w:pPr>
+        <w:rPr>
+          <w:lang w:val="en-US"/>
+        </w:rPr>
+      </w:pPr>
+      <w:r>
+        <w:rPr>
+          <w:lang w:val="en-US"/>
+        </w:rPr>
+        <w:t xml:space="preserve">To explain an example a few terms need to be explained. </w:t>
+      </w:r>
+      <w:r>
+        <w:rPr>
+          <w:lang w:val="en-US"/>
+        </w:rPr>
+        <w:t xml:space="preserve">A battle pass is a type of monetization method that rewards players for playing the game with content or player power. In brawl stars case their battle pass has two tiers a free tier and a paid tier, the free tier gave player a good amount of character power, but the paid tier gave lots of character power while also giving cosmetic items. </w:t>
+      </w:r>
+      <w:r>
+        <w:rPr>
+          <w:lang w:val="en-US"/>
+        </w:rPr>
+        <w:t>Initially</w:t>
+      </w:r>
+      <w:r>
+        <w:rPr>
+          <w:lang w:val="en-US"/>
+        </w:rPr>
+        <w:t xml:space="preserve"> the paid tier could be purchased with brawl stars premium currency. This currency was normally acquired through purchasing it with an in app purchase</w:t>
+      </w:r>
+      <w:r>
+        <w:rPr>
+          <w:lang w:val="en-US"/>
+        </w:rPr>
+        <w:t>, thus premium</w:t>
+      </w:r>
+      <w:r>
+        <w:rPr>
+          <w:lang w:val="en-US"/>
+        </w:rPr>
+        <w:t>. But very importantly some premium currency was given on the free tier of the battle pass. It worked out that every 4 month you could buy the battle pass for free if you saved all the premium currency that you could get for free.</w:t>
+      </w:r>
+      <w:r>
+        <w:rPr>
+          <w:lang w:val="en-US"/>
+        </w:rPr>
+        <w:t xml:space="preserve"> This was great for player that played the game for free, they could get the great rewards from the paid battle pass for free every 4 months.</w:t>
+      </w:r>
+    </w:p>
+    <w:p>
+      <w:pPr>
+        <w:rPr>
+          <w:lang w:val="en-US"/>
+        </w:rPr>
+      </w:pPr>
+      <w:r>
+        <w:rPr>
+          <w:lang w:val="en-US"/>
+        </w:rPr>
+        <w:t xml:space="preserve">Brawl stars wanted to change the paid tier of their battle pass. The change was that you can now only purchase the paid tier directly with an in app purchase. This meant that player playing for free could no longer spend </w:t>
+      </w:r>
+      <w:r>
+        <w:rPr>
+          <w:lang w:val="en-US"/>
+        </w:rPr>
+        <w:t>their</w:t>
+      </w:r>
+      <w:r>
+        <w:rPr>
+          <w:lang w:val="en-US"/>
+        </w:rPr>
+        <w:t xml:space="preserve"> freely earned premium currency to buy the paid tier of the battle pass. This </w:t>
+      </w:r>
+      <w:r>
+        <w:rPr>
+          <w:lang w:val="en-US"/>
+        </w:rPr>
+        <w:t xml:space="preserve">change </w:t>
+      </w:r>
+      <w:r>
+        <w:rPr>
+          <w:lang w:val="en-US"/>
+        </w:rPr>
+        <w:t xml:space="preserve">was a controversial decision and cause the community of brawl stars </w:t>
+      </w:r>
+      <w:r>
+        <w:rPr>
+          <w:lang w:val="en-US"/>
+        </w:rPr>
+        <w:t>to get quiet passionate where or not it was a good one</w:t>
+      </w:r>
+      <w:r>
+        <w:rPr>
+          <w:lang w:val="en-US"/>
+        </w:rPr>
+        <w:t xml:space="preserve"> ()</w:t>
+      </w:r>
+      <w:r>
+        <w:rPr>
+          <w:lang w:val="en-US"/>
+        </w:rPr>
+        <w:t xml:space="preserve">. </w:t>
+      </w:r>
+    </w:p>
+    <w:p>
+      <w:pPr>
+        <w:rPr>
+          <w:lang w:val="en-US"/>
+        </w:rPr>
+      </w:pPr>
+      <w:r>
+        <w:rPr>
+          <w:lang w:val="en-US"/>
+        </w:rPr>
+        <w:t>What could not be said was the change was a surprise</w:t>
+      </w:r>
+      <w:r>
+        <w:rPr>
+          <w:lang w:val="en-US"/>
+        </w:rPr>
+        <w:t>. Brawl stars release a very comprehensive blog post about the change just over one month before they would implement the change</w:t>
+      </w:r>
+      <w:r>
+        <w:rPr>
+          <w:lang w:val="en-US"/>
+        </w:rPr>
+        <w:t xml:space="preserve"> ()</w:t>
       </w:r>
       <w:r>
         <w:rPr>
@@ -389,270 +1037,29 @@
         <w:rPr>
           <w:lang w:val="en-US"/>
         </w:rPr>
-        <w:t xml:space="preserve"> P2W </w:t>
-      </w:r>
-      <w:r>
-        <w:rPr>
-          <w:lang w:val="en-US"/>
-        </w:rPr>
-        <w:t>games are</w:t>
-      </w:r>
-      <w:r>
-        <w:rPr>
-          <w:lang w:val="en-US"/>
-        </w:rPr>
-        <w:t xml:space="preserve"> game</w:t>
-      </w:r>
-      <w:r>
-        <w:rPr>
-          <w:lang w:val="en-US"/>
-        </w:rPr>
-        <w:t>s that</w:t>
-      </w:r>
-      <w:r>
-        <w:rPr>
-          <w:lang w:val="en-US"/>
-        </w:rPr>
-        <w:t xml:space="preserve"> let you buy power within the game with real money. Specifically, the game needs to also be competitive. Examples of this include the obvious, game</w:t>
-      </w:r>
-      <w:r>
-        <w:rPr>
-          <w:lang w:val="en-US"/>
-        </w:rPr>
-        <w:t>s</w:t>
-      </w:r>
-      <w:r>
-        <w:rPr>
-          <w:lang w:val="en-US"/>
-        </w:rPr>
-        <w:t xml:space="preserve"> that have a player vs player element, but also less obvious are games that have leaderboards where players can compete for higher scores.</w:t>
-      </w:r>
-      <w:r>
-        <w:rPr>
-          <w:lang w:val="en-US"/>
-        </w:rPr>
-        <w:t xml:space="preserve"> Brawl stars falls under the player vs player competitive categories and is thus very easy to be pay to win if you allow buying power. In brawl stars each character you want to play has their own power level from 1 to 11, a character at power 11 is twice as strong as a character as power 1. The game is also balance</w:t>
-      </w:r>
-      <w:r>
-        <w:rPr>
-          <w:lang w:val="en-US"/>
-        </w:rPr>
-        <w:t>d</w:t>
-      </w:r>
-      <w:r>
-        <w:rPr>
-          <w:lang w:val="en-US"/>
-        </w:rPr>
-        <w:t xml:space="preserve"> around thinking that everyone is playing characters that are level 11.</w:t>
-      </w:r>
-    </w:p>
-    <w:p>
-      <w:pPr>
-        <w:ind w:firstLine="720"/>
-        <w:rPr>
-          <w:lang w:val="en-US"/>
-        </w:rPr>
-      </w:pPr>
-      <w:r>
-        <w:rPr>
-          <w:lang w:val="en-US"/>
-        </w:rPr>
-        <w:t>Picture of Colt in brawls stars power screen</w:t>
-      </w:r>
-    </w:p>
-    <w:p>
-      <w:pPr>
-        <w:rPr>
-          <w:lang w:val="en-US"/>
-        </w:rPr>
-      </w:pPr>
-      <w:r>
-        <w:rPr>
-          <w:lang w:val="en-US"/>
-        </w:rPr>
-        <w:t>This results in Brawl stars being very pay to win. Especially when you consider how they used to distribute the power. When Brawl Stars had loot boxes you would receive some power tokens for a couple random characters each time you open a box. Then when you collected enough power tokens on a single character you could increase their level. The result of this was on average all your characters increased in power at about the same rate. Meaning if you wanted to play at the designed level of 11 you have to very slowly level all your brawls to that level, highly incentivizing purchasing more boxes to get more power. Luckly they changed the system.</w:t>
-      </w:r>
-    </w:p>
-    <w:p>
-      <w:pPr>
-        <w:rPr>
-          <w:lang w:val="en-US"/>
-        </w:rPr>
-      </w:pPr>
-      <w:r>
-        <w:rPr>
-          <w:lang w:val="en-US"/>
-        </w:rPr>
-        <w:t>This old system made the entire game very P2W</w:t>
-      </w:r>
-      <w:r>
-        <w:rPr>
-          <w:lang w:val="en-US"/>
-        </w:rPr>
-        <w:t>.</w:t>
-      </w:r>
-      <w:r>
-        <w:rPr>
-          <w:lang w:val="en-US"/>
-        </w:rPr>
-        <w:t xml:space="preserve"> I personally have only </w:t>
-      </w:r>
-      <w:r>
-        <w:rPr>
-          <w:lang w:val="en-US"/>
-        </w:rPr>
-        <w:t>spent</w:t>
-      </w:r>
-      <w:r>
-        <w:rPr>
-          <w:lang w:val="en-US"/>
-        </w:rPr>
-        <w:t xml:space="preserve"> 10 dollars on the game to buy a cosmetic item</w:t>
-      </w:r>
-      <w:r>
-        <w:rPr>
-          <w:lang w:val="en-US"/>
-        </w:rPr>
-        <w:t>.</w:t>
-      </w:r>
-      <w:r>
-        <w:rPr>
-          <w:lang w:val="en-US"/>
-        </w:rPr>
-        <w:t xml:space="preserve"> I have </w:t>
-      </w:r>
-      <w:r>
-        <w:rPr>
-          <w:lang w:val="en-US"/>
-        </w:rPr>
-        <w:t>played for</w:t>
-      </w:r>
-      <w:r>
-        <w:rPr>
-          <w:lang w:val="en-US"/>
-        </w:rPr>
-        <w:t xml:space="preserve"> a very long time </w:t>
-      </w:r>
-      <w:r>
-        <w:rPr>
-          <w:lang w:val="en-US"/>
-        </w:rPr>
-        <w:t xml:space="preserve">so am </w:t>
-      </w:r>
-      <w:r>
-        <w:rPr>
-          <w:lang w:val="en-US"/>
-        </w:rPr>
-        <w:t>able to play at the competitive level without paying. When a new player joined</w:t>
-      </w:r>
-      <w:r>
-        <w:rPr>
-          <w:lang w:val="en-US"/>
-        </w:rPr>
-        <w:t>,</w:t>
-      </w:r>
-      <w:r>
-        <w:rPr>
-          <w:lang w:val="en-US"/>
-        </w:rPr>
-        <w:t xml:space="preserve"> when the old power system was in place, they either had to play for over two years or spend </w:t>
-      </w:r>
-      <w:r>
-        <w:rPr>
-          <w:lang w:val="en-US"/>
-        </w:rPr>
-        <w:t xml:space="preserve">a large amount of money to play competitively. </w:t>
-      </w:r>
-      <w:r>
-        <w:rPr>
-          <w:lang w:val="en-US"/>
-        </w:rPr>
-        <w:t>Unfortunately, the younger a person is the more likely they are to buy power to games (</w:t>
-      </w:r>
-      <w:r>
-        <w:rPr>
-          <w:lang w:val="en-US"/>
-        </w:rPr>
-        <w:t>Bernadeta</w:t>
-      </w:r>
-      <w:r>
-        <w:rPr>
-          <w:lang w:val="en-US"/>
-        </w:rPr>
-        <w:t xml:space="preserve">, 2021). </w:t>
-      </w:r>
-      <w:r>
-        <w:rPr>
-          <w:lang w:val="en-US"/>
-        </w:rPr>
-        <w:t>Brawl</w:t>
-      </w:r>
-      <w:r>
-        <w:rPr>
-          <w:lang w:val="en-US"/>
-        </w:rPr>
-        <w:t xml:space="preserve"> Stars </w:t>
-      </w:r>
-      <w:r>
-        <w:rPr>
-          <w:lang w:val="en-US"/>
-        </w:rPr>
-        <w:t>is designed for player</w:t>
-      </w:r>
-      <w:r>
-        <w:rPr>
-          <w:lang w:val="en-US"/>
-        </w:rPr>
-        <w:t>s</w:t>
-      </w:r>
-      <w:r>
-        <w:rPr>
-          <w:lang w:val="en-US"/>
-        </w:rPr>
-        <w:t xml:space="preserve"> that are 13 and </w:t>
-      </w:r>
-      <w:r>
-        <w:rPr>
-          <w:lang w:val="en-US"/>
-        </w:rPr>
-        <w:t xml:space="preserve">above. The game was designed for a </w:t>
-      </w:r>
-      <w:r>
-        <w:rPr>
-          <w:lang w:val="en-US"/>
-        </w:rPr>
-        <w:t>young</w:t>
-      </w:r>
-      <w:r>
-        <w:rPr>
-          <w:lang w:val="en-US"/>
-        </w:rPr>
-        <w:t>er audience. Young people are more susceptible to</w:t>
-      </w:r>
-      <w:r>
-        <w:rPr>
-          <w:lang w:val="en-US"/>
-        </w:rPr>
-        <w:t xml:space="preserve"> fear of missing out</w:t>
-      </w:r>
-      <w:r>
-        <w:rPr>
-          <w:lang w:val="en-US"/>
-        </w:rPr>
-        <w:t>. This fear could compel those of a younger audience</w:t>
-      </w:r>
-      <w:r>
-        <w:rPr>
-          <w:lang w:val="en-US"/>
-        </w:rPr>
-        <w:t xml:space="preserve"> to spend money on the game to keep up with their friends</w:t>
-      </w:r>
-      <w:r>
-        <w:rPr>
-          <w:lang w:val="en-US"/>
-        </w:rPr>
-        <w:t xml:space="preserve"> or remain competitive</w:t>
-      </w:r>
+        <w:t xml:space="preserve"> In this blog post they explained how having the battle pass purchasable with premium currency made it so </w:t>
+      </w:r>
+      <w:r>
+        <w:rPr>
+          <w:lang w:val="en-US"/>
+        </w:rPr>
+        <w:lastRenderedPageBreak/>
+        <w:t>they couldn’t increase the rewards on the paid track because it would increase every</w:t>
+      </w:r>
+      <w:r>
+        <w:rPr>
+          <w:lang w:val="en-US"/>
+        </w:rPr>
+        <w:t xml:space="preserve"> ones progression. What they wanted to do it reward players who spend money on the game. To do this they increased the rewards of the free tier of the battle pass, overcompensating for those players that bought the paid tier every 4 months. The players playing for free got a their progression increased and the people that supported the game were better rewarded. It was a win </w:t>
+      </w:r>
+      <w:proofErr w:type="spellStart"/>
+      <w:r>
+        <w:rPr>
+          <w:lang w:val="en-US"/>
+        </w:rPr>
+        <w:t>win</w:t>
+      </w:r>
+      <w:proofErr w:type="spellEnd"/>
       <w:r>
         <w:rPr>
           <w:lang w:val="en-US"/>
@@ -670,19 +1077,37 @@
         <w:rPr>
           <w:lang w:val="en-US"/>
         </w:rPr>
-        <w:t>Brawl Stars changed their progression system to limit the P2W of the game by making</w:t>
-      </w:r>
-      <w:r>
-        <w:rPr>
-          <w:lang w:val="en-US"/>
-        </w:rPr>
-        <w:t xml:space="preserve"> the power tokens applicable to any characters</w:t>
-      </w:r>
-      <w:r>
-        <w:rPr>
-          <w:lang w:val="en-US"/>
-        </w:rPr>
-        <w:t>. Now when you get power tokens you can spend theme on any character you wish. Unfortunately this does not mean you get more competitive characters. It does mean you can choose which character become competitive first not all your characters become competitive at the same time. This change made it so even a player who only plays for a week can have at least one competitive character. Making it much easier to play with your friends and not feel left out.</w:t>
+        <w:t xml:space="preserve">The fact that brawl stars </w:t>
+      </w:r>
+      <w:r>
+        <w:rPr>
+          <w:lang w:val="en-US"/>
+        </w:rPr>
+        <w:t xml:space="preserve">communicated the battle pass change to the community let players that were saving for a future battle pass could use </w:t>
+      </w:r>
+      <w:r>
+        <w:rPr>
+          <w:lang w:val="en-US"/>
+        </w:rPr>
+        <w:t>their savings</w:t>
+      </w:r>
+      <w:r>
+        <w:rPr>
+          <w:lang w:val="en-US"/>
+        </w:rPr>
+        <w:t xml:space="preserve"> on the current battle pass.</w:t>
+      </w:r>
+      <w:r>
+        <w:rPr>
+          <w:lang w:val="en-US"/>
+        </w:rPr>
+        <w:t xml:space="preserve"> This admittedly long example was the capstone of communication the brawls stars team has done. But they come from humble beginnings. They initially only posted two to three</w:t>
+      </w:r>
+      <w:r>
+        <w:rPr>
+          <w:lang w:val="en-US"/>
+        </w:rPr>
+        <w:t xml:space="preserve"> minutes videos about the next update to the game. These videos had a low production value. Now the update videos are eight to eleven minutes long and have a very high production value. The update videos have gotten better over time and the growth of the game, but more importantly starting in April 2023 brawl stars started releasing a podcast called time to explain. In these podcasts the developers sit down with a community manager and answer questions the community has been asking. These podcasts have given the player a inside look on how the development process works and what the developers are working on allowing players to make more informed decisions about the time they spend on the game.</w:t>
       </w:r>
     </w:p>
     <w:p>
@@ -696,81 +1121,7 @@
         <w:rPr>
           <w:lang w:val="en-US"/>
         </w:rPr>
-        <w:t>https://www-sciencedirect-com.proxy.lib.sfu.ca/science/article/pii/S0747563220303393?via%3Dihub</w:t>
-      </w:r>
-    </w:p>
-    <w:p>
-      <w:pPr>
-        <w:ind w:left="720"/>
-        <w:rPr>
-          <w:lang w:val="en-US"/>
-        </w:rPr>
-      </w:pPr>
-      <w:r>
-        <w:rPr>
-          <w:lang w:val="en-US"/>
-        </w:rPr>
-        <w:lastRenderedPageBreak/>
-        <w:t>Brawl stars switched from a system that randomly gave power to characters to a system you can pick who the power goes to making it so the player can focus on which characters they want to play and feel less inclined to spend money in order to be competitive.</w:t>
-      </w:r>
-    </w:p>
-    <w:p>
-      <w:pPr>
-        <w:ind w:left="720"/>
-        <w:rPr>
-          <w:lang w:val="en-US"/>
-        </w:rPr>
-      </w:pPr>
-      <w:r>
-        <w:rPr>
-          <w:lang w:val="en-US"/>
-        </w:rPr>
-        <w:t>People join communities then want to be competitive in those communities</w:t>
-      </w:r>
-    </w:p>
-    <w:p>
-      <w:pPr>
-        <w:rPr>
-          <w:lang w:val="en-US"/>
-        </w:rPr>
-      </w:pPr>
-      <w:r>
-        <w:rPr>
-          <w:lang w:val="en-US"/>
-        </w:rPr>
-        <w:t>Open communication with community</w:t>
-      </w:r>
-    </w:p>
-    <w:p>
-      <w:pPr>
-        <w:rPr>
-          <w:lang w:val="en-US"/>
-        </w:rPr>
-      </w:pPr>
-    </w:p>
-    <w:p>
-      <w:pPr>
-        <w:rPr>
-          <w:lang w:val="en-US"/>
-        </w:rPr>
-      </w:pPr>
-      <w:r>
-        <w:rPr>
-          <w:lang w:val="en-US"/>
-        </w:rPr>
-        <w:t xml:space="preserve">Lots of game developers have so little communication with their players that they seem secretive. Brawl Stars is the opposite </w:t>
-      </w:r>
-      <w:r>
-        <w:rPr>
-          <w:lang w:val="en-US"/>
-        </w:rPr>
-        <w:t>they are very open with their community.</w:t>
-      </w:r>
-      <w:r>
-        <w:rPr>
-          <w:lang w:val="en-US"/>
-        </w:rPr>
-        <w:t xml:space="preserve"> Having an open line of communication with the community helps keep players understand the development decisions and allows players to make better decisions of their own. </w:t>
+        <w:t>https://www.reddit.com/r/BrawlStarsCompetitive/comments/18y9bzv/new_brawl_pass_what_do_you_think/</w:t>
       </w:r>
     </w:p>
     <w:p>

</xml_diff>